<commit_message>
refactor: update vendor portfolio descriptions for clarity and consistency across CV pages
</commit_message>
<xml_diff>
--- a/assets/Nikos_Vasileiadis_CV.docx
+++ b/assets/Nikos_Vasileiadis_CV.docx
@@ -118,7 +118,7 @@
         <w:t xml:space="preserve"> </w:t>
       </w:r>
       <w:r>
-        <w:t xml:space="preserve">of progressive leadership —</w:t>
+        <w:t xml:space="preserve">of progressive leadership -</w:t>
       </w:r>
       <w:r>
         <w:t xml:space="preserve"> </w:t>
@@ -130,7 +130,7 @@
         <w:t xml:space="preserve"> </w:t>
       </w:r>
       <w:r>
-        <w:t xml:space="preserve">of them line-managing engineers — across regulated industries. I treat engineering as a business lever — contributing to CapEx/OpEx planning and ensuring technical investments map directly to business outcomes. The pattern across those years is consistent: I build the thing that isn’t there — a team where there was no department, documentation from zero, structure where there was firefighting, a career where there was no industry to offer one. Introduced structured delivery in three resistant environments (financial services, a global brand agency, and a greenfield platform team). Technical depth across frontend and platform architecture establishes credibility; my true strength is designing the conditions where engineers do their best work.</w:t>
+        <w:t xml:space="preserve">of them line-managing engineers - across regulated industries. I treat engineering as a business lever - contributing to CapEx/OpEx planning and ensuring technical investments map directly to business outcomes. The pattern across those years is consistent: I build the thing that isn’t there - a team where there was no department, documentation from zero, structure where there was firefighting, a career where there was no industry to offer one. Introduced structured delivery in three resistant environments (financial services, a global brand agency, and a greenfield platform team). Technical depth across frontend and platform architecture establishes credibility; my true strength is designing the conditions where engineers do their best work.</w:t>
       </w:r>
     </w:p>
     <w:bookmarkEnd w:id="12"/>
@@ -162,7 +162,7 @@
         <w:t xml:space="preserve"> </w:t>
       </w:r>
       <w:r>
-        <w:t xml:space="preserve">— building, mentoring, and retaining high-performing remote teams; measurement-led via DORA metrics (DX), team health tracking, and Peakon Heartbeat surveys; reorg communication on a cadence — including empty updates when there’s nothing new — so trust holds when certainty can’t.</w:t>
+        <w:t xml:space="preserve">- building, mentoring, and retaining high-performing remote teams; measurement-led via DORA metrics (DX), team health tracking, and Peakon Heartbeat surveys, so performance stays visible, sustainable, and connected to career progression.</w:t>
       </w:r>
     </w:p>
     <w:p>
@@ -184,7 +184,7 @@
         <w:t xml:space="preserve"> </w:t>
       </w:r>
       <w:r>
-        <w:t xml:space="preserve">— navigating complex restructurings and shaping team structures that align engineering capability with business outcomes; have built the same team twice from zero; staff complementary pairs, not just headcount.</w:t>
+        <w:t xml:space="preserve">- navigating complex restructurings and shaping team structures that align engineering capability with business outcomes; have built the same team twice from zero.</w:t>
       </w:r>
     </w:p>
     <w:p>
@@ -206,7 +206,7 @@
         <w:t xml:space="preserve"> </w:t>
       </w:r>
       <w:r>
-        <w:t xml:space="preserve">— architecting and managing critical platform services with SLAs, SLIs, and operational excellence for</w:t>
+        <w:t xml:space="preserve">- architecting and managing critical platform services with SLAs, SLIs, and operational excellence for</w:t>
       </w:r>
       <w:r>
         <w:t xml:space="preserve"> </w:t>
@@ -240,7 +240,7 @@
         <w:t xml:space="preserve"> </w:t>
       </w:r>
       <w:r>
-        <w:t xml:space="preserve">— end-to-end, from open-source implementation (Pulsar at Jadu) to leading a dedicated Design Systems team at scale.</w:t>
+        <w:t xml:space="preserve">- end-to-end, from open-source implementation (Pulsar at Jadu) to leading a dedicated Design Systems team at scale.</w:t>
       </w:r>
     </w:p>
     <w:p>
@@ -262,16 +262,7 @@
         <w:t xml:space="preserve"> </w:t>
       </w:r>
       <w:r>
-        <w:t xml:space="preserve">— a</w:t>
-      </w:r>
-      <w:r>
-        <w:t xml:space="preserve"> </w:t>
-      </w:r>
-      <w:r>
-        <w:t xml:space="preserve">£200k</w:t>
-      </w:r>
-      <w:r>
-        <w:t xml:space="preserve">+ annual vendor portfolio across six platform services, active contribution to CapEx/OpEx planning, and vendor ROI evaluation; commercial literacy from sitting with compliance, marketing, data, and IT.</w:t>
+        <w:t xml:space="preserve">- a six-figure vendor portfolio across six platform services, active contribution to CapEx/OpEx planning, and vendor ROI evaluation; commercial literacy from sitting with compliance, marketing, data, and IT.</w:t>
       </w:r>
     </w:p>
     <w:p>
@@ -293,7 +284,7 @@
         <w:t xml:space="preserve"> </w:t>
       </w:r>
       <w:r>
-        <w:t xml:space="preserve">— financial services (Leeds Building Society), multi-service utilities including energy (Utility Warehouse), and public sector technology (Jadu / Local Authorities); compliance-driven environments where reliability has regulatory consequences.</w:t>
+        <w:t xml:space="preserve">- financial services (Leeds Building Society), multi-service utilities including energy (Utility Warehouse), and public sector technology (Jadu / Local Authorities); compliance-driven environments where reliability has regulatory consequences.</w:t>
       </w:r>
     </w:p>
     <w:bookmarkEnd w:id="13"/>
@@ -330,13 +321,13 @@
         <w:t xml:space="preserve"> </w:t>
       </w:r>
       <w:r>
-        <w:t xml:space="preserve">(Telecom Plus PLC · FTSE 250 — multi-service provider of energy, broadband, mobile &amp; insurance)</w:t>
+        <w:t xml:space="preserve">(Telecom Plus PLC · FTSE 250 - multi-service provider of energy, broadband, mobile &amp; insurance)</w:t>
       </w:r>
       <w:r>
         <w:br/>
       </w:r>
       <w:r>
-        <w:t xml:space="preserve">Jul 2023 – Present · United Kingdom · Remote</w:t>
+        <w:t xml:space="preserve">Jul 2023 - Present · United Kingdom · Remote</w:t>
       </w:r>
     </w:p>
     <w:p>
@@ -370,7 +361,7 @@
         <w:t xml:space="preserve"> </w:t>
       </w:r>
       <w:r>
-        <w:t xml:space="preserve">with separate backlogs — web/CMS/tracking, mobile, and design systems — alongside a Product Manager. Sustained</w:t>
+        <w:t xml:space="preserve">with separate backlogs - web/CMS/tracking, mobile, and design systems - alongside a Product Manager. Sustained</w:t>
       </w:r>
       <w:r>
         <w:t xml:space="preserve"> </w:t>
@@ -425,7 +416,7 @@
         <w:t xml:space="preserve"> </w:t>
       </w:r>
       <w:r>
-        <w:t xml:space="preserve">Took unguided responsibility for scoping and executing team migrations between pillars during restructurings — mapping scope, chasing stakeholder alignment, and building consensus from scratch. Negotiated skill inbound — a Senior Engineer with mobile expertise — when a mobile backlog entered the team’s remit, rather than stretching the existing team thin; challenged and reversed structural decisions that would have eliminated the Design Systems team — preserving the capability that enabled the 2025 company-wide rebrand.</w:t>
+        <w:t xml:space="preserve">Took unguided responsibility for scoping and executing team migrations between pillars during restructurings - mapping scope, chasing stakeholder alignment, and building consensus from scratch. Negotiated skill inbound - a Senior Engineer with mobile expertise - when a mobile backlog entered the team’s remit, rather than stretching the existing team thin; challenged and reversed structural decisions that would have eliminated the Design Systems team - preserving the capability that enabled the 2025 company-wide rebrand.</w:t>
       </w:r>
     </w:p>
     <w:p>
@@ -441,7 +432,7 @@
           <w:b/>
           <w:bCs/>
         </w:rPr>
-        <w:t xml:space="preserve">Rebranding Programme (Oct 2025 – Apr 2026;</w:t>
+        <w:t xml:space="preserve">Rebranding Programme (Oct 2025 - Apr 2026;</w:t>
       </w:r>
       <w:r>
         <w:rPr>
@@ -468,7 +459,7 @@
         <w:t xml:space="preserve"> </w:t>
       </w:r>
       <w:r>
-        <w:t xml:space="preserve">Delivered UW’s company-wide brand refresh across the full uw.co.uk estate — the primary digital entry point for customers and partners, and the critical path: no other team’s rebranding work could go live until the main website shipped. Authored automated migration scripts that saved content editors hundreds of manual hours.</w:t>
+        <w:t xml:space="preserve">Delivered UW’s company-wide brand refresh across the full uw.co.uk estate - the primary digital entry point for customers and partners, and the critical path: no other team’s rebranding work could go live until the main website shipped. Authored automated migration scripts that saved content editors hundreds of manual hours.</w:t>
       </w:r>
     </w:p>
     <w:p>
@@ -502,7 +493,7 @@
         <w:t xml:space="preserve"> </w:t>
       </w:r>
       <w:r>
-        <w:t xml:space="preserve">— a single incident in the current year, resolved within hours — with</w:t>
+        <w:t xml:space="preserve">- a single incident in the current year, resolved within hours - with</w:t>
       </w:r>
       <w:r>
         <w:t xml:space="preserve"> </w:t>
@@ -589,7 +580,7 @@
         <w:t xml:space="preserve"> </w:t>
       </w:r>
       <w:r>
-        <w:t xml:space="preserve">— Contentful, Google Tag Manager, Snowplow, Mixpanel, Optimizely, and OneTrust.</w:t>
+        <w:t xml:space="preserve">- Contentful, Google Tag Manager, Snowplow, Mixpanel, Optimizely, and OneTrust.</w:t>
       </w:r>
     </w:p>
     <w:p>
@@ -605,7 +596,7 @@
           <w:b/>
           <w:bCs/>
         </w:rPr>
-        <w:t xml:space="preserve">Design Systems (Hearth) —</w:t>
+        <w:t xml:space="preserve">Design Systems (Hearth) -</w:t>
       </w:r>
       <w:r>
         <w:rPr>
@@ -632,7 +623,7 @@
         <w:t xml:space="preserve"> </w:t>
       </w:r>
       <w:r>
-        <w:t xml:space="preserve">Led company-wide adoption (15 full, 5 partial), eliminating thousands of hours of duplicated engineering effort — savings at rebrand scale reaching into the hundreds of thousands — and contributed to R&amp;D tax credit claims with audit-ready documentation for external advisors.</w:t>
+        <w:t xml:space="preserve">Led company-wide adoption (15 full, 5 partial), eliminating thousands of hours of duplicated engineering effort.</w:t>
       </w:r>
     </w:p>
     <w:p>
@@ -654,7 +645,7 @@
         <w:t xml:space="preserve"> </w:t>
       </w:r>
       <w:r>
-        <w:t xml:space="preserve">Led the end-to-end replacement of an effectively abandoned legacy CMS (no SLA, no SSO, dead tech stack) — a rigorous</w:t>
+        <w:t xml:space="preserve">Led the end-to-end replacement of an effectively abandoned legacy CMS (no SLA, no SSO, dead tech stack) - a rigorous</w:t>
       </w:r>
       <w:r>
         <w:t xml:space="preserve"> </w:t>
@@ -678,13 +669,13 @@
         <w:t xml:space="preserve"> </w:t>
       </w:r>
       <w:r>
-        <w:t xml:space="preserve">led to Contentful, a six-figure annual enterprise contract, followed by a zero-disruption dual-serve migration; three marketing teams (</w:t>
+        <w:t xml:space="preserve">led to Contentful on an enterprise contract, followed by a zero-disruption dual-serve migration; three marketing teams (</w:t>
       </w:r>
       <w:r>
         <w:t xml:space="preserve">~18 people</w:t>
       </w:r>
       <w:r>
-        <w:t xml:space="preserve">) gained scheduling and structured content models. The in-house delivery platform the team built (Next.js / React / TypeScript) runs its own GraphQL API over Contentful’s content APIs — request bundling, query optimisation, and on-demand content revalidation, a layer above what the vendor provides.</w:t>
+        <w:t xml:space="preserve">) gained scheduling and structured content models. The in-house delivery platform the team built (Next.js / React / TypeScript) runs its own GraphQL API over Contentful’s content APIs - request bundling, query optimisation, and on-demand content revalidation, a layer above what the vendor provides.</w:t>
       </w:r>
     </w:p>
     <w:p>
@@ -718,7 +709,7 @@
         <w:t xml:space="preserve"> </w:t>
       </w:r>
       <w:r>
-        <w:t xml:space="preserve">of technical documentation — the most thoroughly documented team at UW — and closed capability gaps (e.g. Kubernetes) through self-directed learning before training the team.</w:t>
+        <w:t xml:space="preserve">of technical documentation - the most thoroughly documented team at UW - and closed capability gaps (e.g. Kubernetes) through self-directed learning before training the team.</w:t>
       </w:r>
     </w:p>
     <w:p>
@@ -734,7 +725,7 @@
           <w:b/>
           <w:bCs/>
         </w:rPr>
-        <w:t xml:space="preserve">Adaptability Under Constraints (2025–Present):</w:t>
+        <w:t xml:space="preserve">Adaptability Under Constraints (2025-Present):</w:t>
       </w:r>
       <w:r>
         <w:t xml:space="preserve"> </w:t>
@@ -749,7 +740,7 @@
         <w:t xml:space="preserve">2 engineers</w:t>
       </w:r>
       <w:r>
-        <w:t xml:space="preserve">, absorbed Product Manager and on-call responsibilities alongside Engineering Management — sustaining delivery across</w:t>
+        <w:t xml:space="preserve">, absorbed Product Manager and on-call responsibilities alongside Engineering Management - sustaining delivery across</w:t>
       </w:r>
       <w:r>
         <w:t xml:space="preserve"> </w:t>
@@ -789,7 +780,7 @@
         <w:br/>
       </w:r>
       <w:r>
-        <w:t xml:space="preserve">May 2022 – Jul 2023 (1 yr 3 mos) · United Kingdom · Remote</w:t>
+        <w:t xml:space="preserve">May 2022 - Jul 2023 (1 yr 3 mos) · United Kingdom · Remote</w:t>
       </w:r>
     </w:p>
     <w:p>
@@ -811,7 +802,7 @@
         <w:t xml:space="preserve"> </w:t>
       </w:r>
       <w:r>
-        <w:t xml:space="preserve">Joined as the founding engineer in a standalone team supporting marketing — no department, no processes, no documentation. Started as three — myself, a Product Manager, and an Associate Engineer — and delivered for a full year with a single engineer, whom I line-managed from May 2022: people responsibility</w:t>
+        <w:t xml:space="preserve">Joined as the founding engineer in a standalone team supporting marketing - no department, no processes, no documentation. Started as three - myself, a Product Manager, and an Associate Engineer - and delivered for a full year with a single engineer, whom I line-managed from May 2022: people responsibility</w:t>
       </w:r>
       <w:r>
         <w:t xml:space="preserve"> </w:t>
@@ -835,7 +826,7 @@
         <w:t xml:space="preserve"> </w:t>
       </w:r>
       <w:r>
-        <w:t xml:space="preserve">in May 2023 and promoted the founding Associate a month later — a promotion case I prepared and drove while still Lead.</w:t>
+        <w:t xml:space="preserve">in May 2023 and promoted the founding Associate a month later - a promotion case I prepared and drove while still Lead.</w:t>
       </w:r>
     </w:p>
     <w:p>
@@ -857,7 +848,7 @@
         <w:t xml:space="preserve"> </w:t>
       </w:r>
       <w:r>
-        <w:t xml:space="preserve">Established a fully operational Scrum environment — structured backlog, measurable velocity, predictable delivery — filling Product Manager gaps when needed, and authored the foundational documentation that grew into the team’s</w:t>
+        <w:t xml:space="preserve">Established a fully operational Scrum environment - structured backlog, measurable velocity, predictable delivery - filling Product Manager gaps when needed, and authored the foundational documentation that grew into the team’s</w:t>
       </w:r>
       <w:r>
         <w:t xml:space="preserve"> </w:t>
@@ -891,7 +882,7 @@
         <w:t xml:space="preserve"> </w:t>
       </w:r>
       <w:r>
-        <w:t xml:space="preserve">Led the evaluation that resulted in UW’s adoption of Contentful as its enterprise CMS; presented findings and audit trail to leadership — recommendation accepted and implemented.</w:t>
+        <w:t xml:space="preserve">Led the evaluation that resulted in UW’s adoption of Contentful as its enterprise CMS; presented findings and audit trail to leadership - recommendation accepted and implemented.</w:t>
       </w:r>
     </w:p>
     <w:bookmarkEnd w:id="15"/>
@@ -919,7 +910,7 @@
         <w:br/>
       </w:r>
       <w:r>
-        <w:t xml:space="preserve">Jan 2020 – Apr 2022 (2 yrs 4 mos) · Leeds, UK · Hybrid</w:t>
+        <w:t xml:space="preserve">Jan 2020 - Apr 2022 (2 yrs 4 mos) · Leeds, UK · Hybrid</w:t>
       </w:r>
     </w:p>
     <w:p>
@@ -927,7 +918,7 @@
         <w:pStyle w:val="BodyText"/>
       </w:pPr>
       <w:r>
-        <w:t xml:space="preserve">Dual-role technical leader for global brands (Adidas, MARS) — architecting frontend solutions while formally holding Scrum Master responsibilities to raise the organisation’s delivery standards.</w:t>
+        <w:t xml:space="preserve">Dual-role technical leader for global brands (Adidas, MARS) - architecting frontend solutions while formally holding Scrum Master responsibilities to raise the organisation’s delivery standards.</w:t>
       </w:r>
     </w:p>
     <w:p>
@@ -949,7 +940,7 @@
         <w:t xml:space="preserve"> </w:t>
       </w:r>
       <w:r>
-        <w:t xml:space="preserve">Introduced structured Agile/Scrum practices to an agency running entirely on ad-hoc, fire-driven delivery — measurable sprint velocity, predictable project allocation, and regular client demos.</w:t>
+        <w:t xml:space="preserve">Introduced structured Agile/Scrum practices to an agency running entirely on ad-hoc, fire-driven delivery - measurable sprint velocity, predictable project allocation, and regular client demos.</w:t>
       </w:r>
     </w:p>
     <w:p>
@@ -971,7 +962,7 @@
         <w:t xml:space="preserve"> </w:t>
       </w:r>
       <w:r>
-        <w:t xml:space="preserve">Architected the frontend for Royal Canin’s global web presence — a single design system serving</w:t>
+        <w:t xml:space="preserve">Architected the frontend for Royal Canin’s global web presence - a single design system serving</w:t>
       </w:r>
       <w:r>
         <w:t xml:space="preserve"> </w:t>
@@ -1042,7 +1033,7 @@
         <w:br/>
       </w:r>
       <w:r>
-        <w:t xml:space="preserve">Oct 2018 – Jan 2020 (1 yr 4 mos) · Leeds, UK · Hybrid</w:t>
+        <w:t xml:space="preserve">Oct 2018 - Jan 2020 (1 yr 4 mos) · Leeds, UK · Hybrid</w:t>
       </w:r>
     </w:p>
     <w:p>
@@ -1050,7 +1041,7 @@
         <w:pStyle w:val="BodyText"/>
       </w:pPr>
       <w:r>
-        <w:t xml:space="preserve">Maintained public-facing digital assets for the UK’s 5th largest building society — a highly regulated financial services environment — while mentoring teams on code quality and UX standards.</w:t>
+        <w:t xml:space="preserve">Maintained public-facing digital assets for the UK’s 5th largest building society - a highly regulated financial services environment - while mentoring teams on code quality and UX standards.</w:t>
       </w:r>
     </w:p>
     <w:p>
@@ -1072,7 +1063,7 @@
         <w:t xml:space="preserve"> </w:t>
       </w:r>
       <w:r>
-        <w:t xml:space="preserve">Introduced Agile and Scrum to LBS for the first time — voluntary ways-of-working forums (off-site, cross-functional) that grew championing into a parallel Scrum Master role, then a formal Interim SM appointment (Jun–Oct 2019) to stabilise Digital Transformation alongside external consultants.</w:t>
+        <w:t xml:space="preserve">Introduced Agile and Scrum to LBS for the first time - voluntary ways-of-working forums (off-site, cross-functional) that grew championing into a parallel Scrum Master role, then a formal Interim SM appointment (Jun-Oct 2019) to stabilise Digital Transformation alongside external consultants.</w:t>
       </w:r>
     </w:p>
     <w:bookmarkEnd w:id="17"/>
@@ -1100,7 +1091,7 @@
         <w:br/>
       </w:r>
       <w:r>
-        <w:t xml:space="preserve">Jan 2017 – Oct 2018 (1 yr 10 mos) · Leeds, UK · Hybrid</w:t>
+        <w:t xml:space="preserve">Jan 2017 - Oct 2018 (1 yr 10 mos) · Leeds, UK · Hybrid</w:t>
       </w:r>
     </w:p>
     <w:p>
@@ -1108,7 +1099,7 @@
         <w:pStyle w:val="BodyText"/>
       </w:pPr>
       <w:r>
-        <w:t xml:space="preserve">Designed UIs and developed features for an award-winning CMS used by Local Authorities, Higher Education, and third-sector organisations — with UX, accessibility, and W3C standards as non-negotiables.</w:t>
+        <w:t xml:space="preserve">Designed UIs and developed features for an award-winning CMS used by Local Authorities, Higher Education, and third-sector organisations - with UX, accessibility, and W3C standards as non-negotiables.</w:t>
       </w:r>
     </w:p>
     <w:p>
@@ -1146,7 +1137,7 @@
         <w:t xml:space="preserve"> </w:t>
       </w:r>
       <w:r>
-        <w:t xml:space="preserve">— an open-source UX and Interface Design System powering the Jadu Continuum Platform, and the foundation of my Design Systems specialism.</w:t>
+        <w:t xml:space="preserve">- an open-source UX and Interface Design System powering the Jadu Continuum Platform, and the foundation of my Design Systems specialism.</w:t>
       </w:r>
     </w:p>
     <w:p>
@@ -1168,7 +1159,7 @@
         <w:t xml:space="preserve"> </w:t>
       </w:r>
       <w:r>
-        <w:t xml:space="preserve">Owned the full feature lifecycle as one of three product-area leads (CMS, Forms, CRM) — regular on-site contextual inquiry at client organisations (Wyre, Rotherham, and City of York Councils, Greater Manchester Combined Authority, University of Leeds), field research shaping the product roadmap, and iteration from mockups through usability testing to release.</w:t>
+        <w:t xml:space="preserve">Owned the full feature lifecycle as one of three product-area leads (CMS, Forms, CRM) - regular on-site contextual inquiry at client organisations (Wyre, Rotherham, and City of York Councils, Greater Manchester Combined Authority, University of Leeds), field research shaping the product roadmap, and iteration from mockups through usability testing to release.</w:t>
       </w:r>
     </w:p>
     <w:p>
@@ -1205,7 +1196,7 @@
         <w:t xml:space="preserve">Projects</w:t>
       </w:r>
       <w:r>
-        <w:t xml:space="preserve">: Award-winning custom CMS for large-scale public sector institutions — open-source Interface Design System (</w:t>
+        <w:t xml:space="preserve">: Award-winning custom CMS for large-scale public sector institutions - open-source Interface Design System (</w:t>
       </w:r>
       <w:hyperlink r:id="rId18">
         <w:r>
@@ -1234,7 +1225,7 @@
         <w:pStyle w:val="FirstParagraph"/>
       </w:pPr>
       <w:r>
-        <w:t xml:space="preserve">Oct 2005 – Dec 2016 (11 years)</w:t>
+        <w:t xml:space="preserve">Oct 2005 - Dec 2016 (11 years)</w:t>
       </w:r>
     </w:p>
     <w:p>
@@ -1242,7 +1233,7 @@
         <w:pStyle w:val="BodyText"/>
       </w:pPr>
       <w:r>
-        <w:t xml:space="preserve">Provincial northern Greece — Xanthi, where I grew up; Serres, where I studied: no tech industry to join and, after 2010, barely an economy. I built the career anyway — client by client — and led long before anyone gave me a title for it:</w:t>
+        <w:t xml:space="preserve">Provincial northern Greece - Xanthi, where I grew up; Serres, where I studied: no tech industry to join and, after 2010, barely an economy. I built the career anyway - client by client - and led long before anyone gave me a title for it:</w:t>
       </w:r>
     </w:p>
     <w:p>
@@ -1258,13 +1249,13 @@
           <w:b/>
           <w:bCs/>
         </w:rPr>
-        <w:t xml:space="preserve">Web Development &amp; Freelancing (2005–2015):</w:t>
-      </w:r>
-      <w:r>
-        <w:t xml:space="preserve"> </w:t>
-      </w:r>
-      <w:r>
-        <w:t xml:space="preserve">Delivered 40+ web projects across Greece and internationally — from local non-profits and bands to a Bitcoin job board for a client in California — managing end-to-end client relationships, professional billing structures, and distributed development teams.</w:t>
+        <w:t xml:space="preserve">Web Development &amp; Freelancing (2005-2015):</w:t>
+      </w:r>
+      <w:r>
+        <w:t xml:space="preserve"> </w:t>
+      </w:r>
+      <w:r>
+        <w:t xml:space="preserve">Delivered 40+ web projects across Greece and internationally - from local non-profits and bands to a Bitcoin job board for a client in California - managing end-to-end client relationships, professional billing structures, and distributed development teams.</w:t>
       </w:r>
     </w:p>
     <w:p>
@@ -1280,13 +1271,13 @@
           <w:b/>
           <w:bCs/>
         </w:rPr>
-        <w:t xml:space="preserve">Community &amp; Civic Technology (2008–2014):</w:t>
-      </w:r>
-      <w:r>
-        <w:t xml:space="preserve"> </w:t>
-      </w:r>
-      <w:r>
-        <w:t xml:space="preserve">Co-founded the Serres Linux Users Group, organised FOSSCOMM 2012 (a 350-person national open-source conference), and managed the digital presence for UNESCO Serres and other civic organisations — a portfolio that predates and directly informs my later UK community work (GDG Leeds, IxDF Leeds, NUX).</w:t>
+        <w:t xml:space="preserve">Community &amp; Civic Technology (2008-2014):</w:t>
+      </w:r>
+      <w:r>
+        <w:t xml:space="preserve"> </w:t>
+      </w:r>
+      <w:r>
+        <w:t xml:space="preserve">Co-founded the Serres Linux Users Group, organised FOSSCOMM 2012 (a 350-person national open-source conference), and managed the digital presence for UNESCO Serres and other civic organisations - a portfolio that predates and directly informs my later UK community work (GDG Leeds, IxDF Leeds, NUX).</w:t>
       </w:r>
     </w:p>
     <w:p>
@@ -1302,13 +1293,13 @@
           <w:b/>
           <w:bCs/>
         </w:rPr>
-        <w:t xml:space="preserve">Teaching &amp; Mentorship (2006–2012):</w:t>
-      </w:r>
-      <w:r>
-        <w:t xml:space="preserve"> </w:t>
-      </w:r>
-      <w:r>
-        <w:t xml:space="preserve">Earned a Certified Training Professional (CTP) qualification and spent a year teaching ECDL to adult learners. Privately tutored a student in algorithmic logic, C, and hardware — that student went on into software engineering and is now an Engineering Manager.</w:t>
+        <w:t xml:space="preserve">Teaching &amp; Mentorship (2006-2012):</w:t>
+      </w:r>
+      <w:r>
+        <w:t xml:space="preserve"> </w:t>
+      </w:r>
+      <w:r>
+        <w:t xml:space="preserve">Earned a Certified Training Professional (CTP) qualification and spent a year teaching ECDL to adult learners. Privately tutored a student in algorithmic logic, C, and hardware - that student went on into software engineering and is now an Engineering Manager.</w:t>
       </w:r>
     </w:p>
     <w:p>
@@ -1324,13 +1315,13 @@
           <w:b/>
           <w:bCs/>
         </w:rPr>
-        <w:t xml:space="preserve">UK Agency Work (2015–2016):</w:t>
-      </w:r>
-      <w:r>
-        <w:t xml:space="preserve"> </w:t>
-      </w:r>
-      <w:r>
-        <w:t xml:space="preserve">Relocated to Leeds — frontend engineering for agencies, building responsive e-commerce for global fashion brands (Vivienne Westwood) and driving performance optimisation.</w:t>
+        <w:t xml:space="preserve">UK Agency Work (2015-2016):</w:t>
+      </w:r>
+      <w:r>
+        <w:t xml:space="preserve"> </w:t>
+      </w:r>
+      <w:r>
+        <w:t xml:space="preserve">Relocated to Leeds - frontend engineering for agencies, building responsive e-commerce for global fashion brands (Vivienne Westwood) and driving performance optimisation.</w:t>
       </w:r>
     </w:p>
     <w:bookmarkEnd w:id="20"/>
@@ -1369,7 +1360,7 @@
         <w:t xml:space="preserve">Degree</w:t>
       </w:r>
       <w:r>
-        <w:t xml:space="preserve">: BSc Informatics Engineering (2007–2012) — strong grades in software engineering, programming, and databases. Left without the certificate when the Greek economic crisis hit; the freelance business I was already running became the career.</w:t>
+        <w:t xml:space="preserve">: BSc Informatics Engineering (2007-2012) - strong grades in software engineering, programming, and databases. Left without the certificate when the Greek economic crisis hit; the freelance business I was already running became the career.</w:t>
       </w:r>
     </w:p>
     <w:bookmarkEnd w:id="22"/>
@@ -1429,7 +1420,7 @@
         <w:t xml:space="preserve"> </w:t>
       </w:r>
       <w:r>
-        <w:t xml:space="preserve">· MHFA England &amp; UK Health Security Agency, 2022–2023</w:t>
+        <w:t xml:space="preserve">· MHFA England &amp; UK Health Security Agency, 2022-2023</w:t>
       </w:r>
       <w:r>
         <w:br/>
@@ -1473,7 +1464,7 @@
           <w:i/>
           <w:iCs/>
         </w:rPr>
-        <w:t xml:space="preserve">Full credentials list — Scrum, UX, FinTech, analytics, cloud, accessibility, and more — available on the</w:t>
+        <w:t xml:space="preserve">Full credentials list - Scrum, UX, FinTech, analytics, cloud, accessibility, and more - available on the</w:t>
       </w:r>
       <w:r>
         <w:rPr>
@@ -1536,7 +1527,7 @@
           <w:i/>
           <w:iCs/>
         </w:rPr>
-        <w:t xml:space="preserve">(Feb 2023–Present)</w:t>
+        <w:t xml:space="preserve">(Feb 2023-Present)</w:t>
       </w:r>
       <w:r>
         <w:t xml:space="preserve">: Mentored engineers who progressed into Engineering Manager roles (both within UW and externally). Peer mentoring network spanning Engineering Managers, Heads of Engineering, VPs, and CTOs.</w:t>
@@ -1561,7 +1552,7 @@
           <w:i/>
           <w:iCs/>
         </w:rPr>
-        <w:t xml:space="preserve">(Aug 2023–Jan 2024)</w:t>
+        <w:t xml:space="preserve">(Aug 2023-Jan 2024)</w:t>
       </w:r>
       <w:r>
         <w:t xml:space="preserve">: Supported early-career engineers entering the industry.</w:t>
@@ -1586,7 +1577,7 @@
           <w:i/>
           <w:iCs/>
         </w:rPr>
-        <w:t xml:space="preserve">(Jan 2019–Mar 2020)</w:t>
+        <w:t xml:space="preserve">(Jan 2019-Mar 2020)</w:t>
       </w:r>
       <w:r>
         <w:t xml:space="preserve">: Revived an inactive GDG chapter; organised conferences, workshops, and technical meetups.</w:t>

</xml_diff>

<commit_message>
Update CVs and related assets; enhance SVG graphics; remove outdated images; refine markdown content for clarity and impact.
</commit_message>
<xml_diff>
--- a/assets/Nikos_Vasileiadis_CV.docx
+++ b/assets/Nikos_Vasileiadis_CV.docx
@@ -394,7 +394,7 @@
         <w:t xml:space="preserve"> </w:t>
       </w:r>
       <w:r>
-        <w:t xml:space="preserve">through evidence-based cases informed by DORA metrics and Peakon Heartbeat surveys; developed talent other teams had passed over; mentored engineers who moved into Engineering Manager roles both internally and externally.</w:t>
+        <w:t xml:space="preserve">through evidence-based cases informed by DORA metrics and Peakon Heartbeat surveys; developed engineers who hadn’t found the right home elsewhere in the organisation; mentored engineers who moved into Engineering Manager roles both internally and externally.</w:t>
       </w:r>
     </w:p>
     <w:p>
@@ -416,7 +416,7 @@
         <w:t xml:space="preserve"> </w:t>
       </w:r>
       <w:r>
-        <w:t xml:space="preserve">Took unguided responsibility for scoping and executing team migrations between pillars during restructurings - mapping scope, chasing stakeholder alignment, and building consensus from scratch. Negotiated skill inbound - a Senior Engineer with mobile expertise - when a mobile backlog entered the team’s remit, rather than stretching the existing team thin; challenged and reversed structural decisions that would have eliminated the Design Systems team - preserving the capability that enabled the 2025 company-wide rebrand.</w:t>
+        <w:t xml:space="preserve">Scoped and executed the team’s moves between pillars during restructurings - mapping scope, aligning stakeholders, and building consensus. Negotiated skill inbound - a Senior Engineer with mobile expertise - when a mobile backlog entered the team’s remit, rather than stretching the existing team thin; argued successfully against a proposal to merge the Design Systems team into another team - preserving the capability that enabled the 2025 company-wide rebrand.</w:t>
       </w:r>
     </w:p>
     <w:p>
@@ -645,7 +645,7 @@
         <w:t xml:space="preserve"> </w:t>
       </w:r>
       <w:r>
-        <w:t xml:space="preserve">Led the end-to-end replacement of an effectively abandoned legacy CMS (no SLA, no SSO, dead tech stack) - a rigorous</w:t>
+        <w:t xml:space="preserve">Led the end-to-end replacement of a legacy CMS on an ageing tech stack (no SLA, no SSO) - a rigorous</w:t>
       </w:r>
       <w:r>
         <w:t xml:space="preserve"> </w:t>
@@ -709,7 +709,7 @@
         <w:t xml:space="preserve"> </w:t>
       </w:r>
       <w:r>
-        <w:t xml:space="preserve">of technical documentation - the most thoroughly documented team at UW - and closed capability gaps (e.g. Kubernetes) through self-directed learning before training the team.</w:t>
+        <w:t xml:space="preserve">of technical documentation - one of the most thoroughly documented teams at UW - and closed capability gaps (e.g. Kubernetes) through self-directed learning before training the team.</w:t>
       </w:r>
     </w:p>
     <w:p>
@@ -731,7 +731,7 @@
         <w:t xml:space="preserve"> </w:t>
       </w:r>
       <w:r>
-        <w:t xml:space="preserve">After restructurings reduced the team to</w:t>
+        <w:t xml:space="preserve">With the team at a specialist core of</w:t>
       </w:r>
       <w:r>
         <w:t xml:space="preserve"> </w:t>
@@ -740,7 +740,10 @@
         <w:t xml:space="preserve">2 engineers</w:t>
       </w:r>
       <w:r>
-        <w:t xml:space="preserve">, absorbed Product Manager and on-call responsibilities alongside Engineering Management - sustaining delivery across</w:t>
+        <w:t xml:space="preserve"> </w:t>
+      </w:r>
+      <w:r>
+        <w:t xml:space="preserve">after the reorganisations, took on Product Manager and on-call responsibilities alongside Engineering Management - sustaining delivery across</w:t>
       </w:r>
       <w:r>
         <w:t xml:space="preserve"> </w:t>

</xml_diff>

<commit_message>
fix: update CV and personal narrative for clarity and inclusivity
</commit_message>
<xml_diff>
--- a/assets/Nikos_Vasileiadis_CV.docx
+++ b/assets/Nikos_Vasileiadis_CV.docx
@@ -130,7 +130,16 @@
         <w:t xml:space="preserve"> </w:t>
       </w:r>
       <w:r>
-        <w:t xml:space="preserve">of them line-managing engineers - across regulated industries. I treat engineering as a business lever - contributing to CapEx/OpEx planning and ensuring technical investments map directly to business outcomes. The pattern across those years is consistent: I build the thing that isn’t there - a team where there was no department, documentation from zero, structure where there was firefighting, a career where there was no industry to offer one. Introduced structured delivery in three resistant environments (financial services, a global brand agency, and a greenfield platform team). Technical depth across frontend and platform architecture establishes credibility; my true strength is designing the conditions where engineers do their best work.</w:t>
+        <w:t xml:space="preserve">of them line-managing engineers - across regulated industries, leading cross-cultural teams and working with people from</w:t>
+      </w:r>
+      <w:r>
+        <w:t xml:space="preserve"> </w:t>
+      </w:r>
+      <w:r>
+        <w:t xml:space="preserve">12+ countries</w:t>
+      </w:r>
+      <w:r>
+        <w:t xml:space="preserve">. I treat engineering as a business lever - contributing to CapEx/OpEx planning and ensuring technical investments map directly to business outcomes. The pattern across those years is consistent: I build the thing that isn’t there - a team where there was no department, documentation from zero, structure where there was firefighting, a career where there was no industry to offer one. Introduced structured delivery in three resistant environments (financial services, a global brand agency, and a greenfield platform team). Technical depth across frontend and platform architecture establishes credibility; my true strength is designing the conditions where engineers do their best work.</w:t>
       </w:r>
     </w:p>
     <w:bookmarkEnd w:id="12"/>
@@ -1236,7 +1245,7 @@
         <w:pStyle w:val="BodyText"/>
       </w:pPr>
       <w:r>
-        <w:t xml:space="preserve">Provincial northern Greece - Xanthi, where I grew up; Serres, where I studied: no tech industry to join and, after 2010, barely an economy. I built the career anyway - client by client - and led long before anyone gave me a title for it:</w:t>
+        <w:t xml:space="preserve">Provincial northern Greece: no tech industry to join and, after 2010, barely an economy. I built the career anyway and led long before I had a title for it:</w:t>
       </w:r>
     </w:p>
     <w:p>
@@ -1252,13 +1261,13 @@
           <w:b/>
           <w:bCs/>
         </w:rPr>
-        <w:t xml:space="preserve">Web Development &amp; Freelancing (2005-2015):</w:t>
-      </w:r>
-      <w:r>
-        <w:t xml:space="preserve"> </w:t>
-      </w:r>
-      <w:r>
-        <w:t xml:space="preserve">Delivered 40+ web projects across Greece and internationally - from local non-profits and bands to a Bitcoin job board for a client in California - managing end-to-end client relationships, professional billing structures, and distributed development teams.</w:t>
+        <w:t xml:space="preserve">Freelance (2005-2015):</w:t>
+      </w:r>
+      <w:r>
+        <w:t xml:space="preserve"> </w:t>
+      </w:r>
+      <w:r>
+        <w:t xml:space="preserve">40+ web projects, working with people in Canada, India, Belgium, the UK, the US, and Denmark.</w:t>
       </w:r>
     </w:p>
     <w:p>
@@ -1274,13 +1283,13 @@
           <w:b/>
           <w:bCs/>
         </w:rPr>
-        <w:t xml:space="preserve">Community &amp; Civic Technology (2008-2014):</w:t>
-      </w:r>
-      <w:r>
-        <w:t xml:space="preserve"> </w:t>
-      </w:r>
-      <w:r>
-        <w:t xml:space="preserve">Co-founded the Serres Linux Users Group, organised FOSSCOMM 2012 (a 350-person national open-source conference), and managed the digital presence for UNESCO Serres and other civic organisations - a portfolio that predates and directly informs my later UK community work (GDG Leeds, IxDF Leeds, NUX).</w:t>
+        <w:t xml:space="preserve">Community (2008-2014):</w:t>
+      </w:r>
+      <w:r>
+        <w:t xml:space="preserve"> </w:t>
+      </w:r>
+      <w:r>
+        <w:t xml:space="preserve">Co-founded the Serres Linux Users Group; organised FOSSCOMM 2012, a 350-person national open-source conference.</w:t>
       </w:r>
     </w:p>
     <w:p>
@@ -1296,13 +1305,13 @@
           <w:b/>
           <w:bCs/>
         </w:rPr>
-        <w:t xml:space="preserve">Teaching &amp; Mentorship (2006-2012):</w:t>
-      </w:r>
-      <w:r>
-        <w:t xml:space="preserve"> </w:t>
-      </w:r>
-      <w:r>
-        <w:t xml:space="preserve">Earned a Certified Training Professional (CTP) qualification and spent a year teaching ECDL to adult learners. Privately tutored a student in algorithmic logic, C, and hardware - that student went on into software engineering and is now an Engineering Manager.</w:t>
+        <w:t xml:space="preserve">Teaching (2006-2012):</w:t>
+      </w:r>
+      <w:r>
+        <w:t xml:space="preserve"> </w:t>
+      </w:r>
+      <w:r>
+        <w:t xml:space="preserve">Taught adult learners and tutored a student who is now an Engineering Manager.</w:t>
       </w:r>
     </w:p>
     <w:p>
@@ -1318,13 +1327,13 @@
           <w:b/>
           <w:bCs/>
         </w:rPr>
-        <w:t xml:space="preserve">UK Agency Work (2015-2016):</w:t>
-      </w:r>
-      <w:r>
-        <w:t xml:space="preserve"> </w:t>
-      </w:r>
-      <w:r>
-        <w:t xml:space="preserve">Relocated to Leeds - frontend engineering for agencies, building responsive e-commerce for global fashion brands (Vivienne Westwood) and driving performance optimisation.</w:t>
+        <w:t xml:space="preserve">UK agencies (2015-2016):</w:t>
+      </w:r>
+      <w:r>
+        <w:t xml:space="preserve"> </w:t>
+      </w:r>
+      <w:r>
+        <w:t xml:space="preserve">Moved to Leeds; frontend engineering for global fashion brands (Vivienne Westwood).</w:t>
       </w:r>
     </w:p>
     <w:bookmarkEnd w:id="20"/>

</xml_diff>